<commit_message>
Pulsador pull-down: resultados en placa y conector UART
- platformio.ini: Serial por el conector UART (CH343), la opcion por
  defecto de Arduino IDE y la usada en la practica
- evidencias: registros del monitor serie de la placa (arranque y 37
  pulsaciones), su captura y las fotos del montaje
- informe y README: pruebas P1 y P3 a P6 completadas con los datos de
  la placa; placa usada (Muse Lab, compatible con la DevKitC-1)
- .gitignore: excluir los ficheros temporales de Word
</commit_message>
<xml_diff>
--- a/Pulsador con pull-down interno/docs/Informe_tecnico_Pulsador_pull-down_interno_ESP32-C6.docx
+++ b/Pulsador con pull-down interno/docs/Informe_tecnico_Pulsador_pull-down_interno_ESP32-C6.docx
@@ -1885,7 +1885,7 @@
                 <w:sz w:val="19"/>
                 <w:szCs w:val="19"/>
               </w:rPr>
-              <w:t xml:space="preserve">ESP32‑C6‑DevKitC‑1</w:t>
+              <w:t xml:space="preserve">Placa de desarrollo ESP32‑C6</w:t>
             </w:r>
           </w:p>
         </w:tc>
@@ -1933,7 +1933,7 @@
                 <w:sz w:val="19"/>
                 <w:szCs w:val="19"/>
               </w:rPr>
-              <w:t xml:space="preserve">Cualquier placa con ESP32‑C6 sirve cambiando los pines</w:t>
+              <w:t xml:space="preserve">Usada: modelo de Muse Lab compatible con la ESP32‑C6‑DevKitC‑1 (mismo chip y conversor CH343, otro orden de pines)</w:t>
             </w:r>
           </w:p>
         </w:tc>
@@ -1962,7 +1962,7 @@
                 <w:sz w:val="19"/>
                 <w:szCs w:val="19"/>
               </w:rPr>
-              <w:t xml:space="preserve">LED RGB de 4 patas</w:t>
+              <w:t xml:space="preserve">Módulo LED RGB de 4 pines</w:t>
             </w:r>
           </w:p>
         </w:tc>
@@ -2010,7 +2010,7 @@
                 <w:sz w:val="19"/>
                 <w:szCs w:val="19"/>
               </w:rPr>
-              <w:t xml:space="preserve">Cátodo común (lo habitual) o ánodo común, configurable</w:t>
+              <w:t xml:space="preserve">Cátodo común; el código admite también ánodo común</w:t>
             </w:r>
           </w:p>
         </w:tc>
@@ -2241,7 +2241,7 @@
                 <w:sz w:val="19"/>
                 <w:szCs w:val="19"/>
               </w:rPr>
-              <w:t xml:space="preserve">Al conector «USB» de la placa</w:t>
+              <w:t xml:space="preserve">Al conector «UART» de la placa</w:t>
             </w:r>
           </w:p>
         </w:tc>
@@ -2456,7 +2456,7 @@
                 <w:sz w:val="19"/>
                 <w:szCs w:val="19"/>
               </w:rPr>
-              <w:t xml:space="preserve">Conector de la placa</w:t>
+              <w:t xml:space="preserve">Posición en la DevKitC‑1</w:t>
             </w:r>
           </w:p>
         </w:tc>
@@ -3315,6 +3315,17 @@
         <w:rPr>
           <w:color w:val="1A1A1A"/>
         </w:rPr>
+        <w:t xml:space="preserve">La figura muestra la DevKitC‑1 oficial de Espressif. La placa usada en la práctica es un modelo compatible de Muse Lab (ver la foto del montaje en 5.2), con el mismo chip pero los pines en otro orden. Lo que cuenta es el número de GPIO serigrafiado junto a cada pin, no su posición.</w:t>
+      </w:r>
+    </w:p>
+    <w:p>
+      <w:pPr>
+        <w:spacing w:after="140"/>
+      </w:pPr>
+      <w:r>
+        <w:rPr>
+          <w:color w:val="1A1A1A"/>
+        </w:rPr>
         <w:t xml:space="preserve">Pautas del montaje:</w:t>
       </w:r>
     </w:p>
@@ -3866,7 +3877,7 @@
         <w:rPr>
           <w:color w:val="1A1A1A"/>
         </w:rPr>
-        <w:t xml:space="preserve">. Es una limitación nominal, no un limitador de corriente preciso: si se consigue una resistencia de 220–330 Ω por color, conviene ponerla.</w:t>
+        <w:t xml:space="preserve">. Es una limitación nominal, no un limitador de corriente preciso: si se consigue una resistencia de 220–330 Ω por color, conviene ponerla. El LED usado es un módulo de 4 pines; si trae sus propias resistencias, la fuerza reducida queda como protección adicional.</w:t>
       </w:r>
     </w:p>
     <w:p>
@@ -4201,7 +4212,7 @@
                 <w:sz w:val="19"/>
                 <w:szCs w:val="19"/>
               </w:rPr>
-              <w:t xml:space="preserve">277 454 B (21,2 %)</w:t>
+              <w:t xml:space="preserve">286 114 B (21,8 %)</w:t>
             </w:r>
           </w:p>
         </w:tc>
@@ -4225,7 +4236,7 @@
                 <w:sz w:val="19"/>
                 <w:szCs w:val="19"/>
               </w:rPr>
-              <w:t xml:space="preserve">15 224 B (4,6 %)</w:t>
+              <w:t xml:space="preserve">15 048 B (4,6 %)</w:t>
             </w:r>
           </w:p>
         </w:tc>
@@ -4312,7 +4323,7 @@
                 <w:sz w:val="19"/>
                 <w:szCs w:val="19"/>
               </w:rPr>
-              <w:t xml:space="preserve">277 550 B (21,2 %)</w:t>
+              <w:t xml:space="preserve">286 212 B (21,8 %)</w:t>
             </w:r>
           </w:p>
         </w:tc>
@@ -4336,7 +4347,7 @@
                 <w:sz w:val="19"/>
                 <w:szCs w:val="19"/>
               </w:rPr>
-              <w:t xml:space="preserve">15 224 B (4,6 %)</w:t>
+              <w:t xml:space="preserve">15 048 B (4,6 %)</w:t>
             </w:r>
           </w:p>
         </w:tc>
@@ -4410,7 +4421,92 @@
         <w:rPr>
           <w:color w:val="1A1A1A"/>
         </w:rPr>
-        <w:t xml:space="preserve">Dos problemas encontrados al compilar, documentados en el </w:t>
+        <w:t xml:space="preserve">El entorno </w:t>
+      </w:r>
+      <w:r>
+        <w:rPr>
+          <w:rFonts w:ascii="Consolas" w:cs="Consolas" w:eastAsia="Consolas" w:hAnsi="Consolas"/>
+          <w:color w:val="9A3412"/>
+          <w:sz w:val="19"/>
+          <w:szCs w:val="19"/>
+          <w:shd w:fill="F2F2EF" w:val="clear"/>
+        </w:rPr>
+        <w:t xml:space="preserve">pulldown_interno</w:t>
+      </w:r>
+      <w:r>
+        <w:rPr>
+          <w:color w:val="1A1A1A"/>
+        </w:rPr>
+        <w:t xml:space="preserve"> se grabó en la placa por el puerto </w:t>
+      </w:r>
+      <w:r>
+        <w:rPr>
+          <w:b/>
+          <w:bCs/>
+          <w:color w:val="1A1A1A"/>
+        </w:rPr>
+        <w:t xml:space="preserve">COM5</w:t>
+      </w:r>
+      <w:r>
+        <w:rPr>
+          <w:color w:val="1A1A1A"/>
+        </w:rPr>
+        <w:t xml:space="preserve">. </w:t>
+      </w:r>
+      <w:r>
+        <w:rPr>
+          <w:rFonts w:ascii="Consolas" w:cs="Consolas" w:eastAsia="Consolas" w:hAnsi="Consolas"/>
+          <w:color w:val="9A3412"/>
+          <w:sz w:val="19"/>
+          <w:szCs w:val="19"/>
+          <w:shd w:fill="F2F2EF" w:val="clear"/>
+        </w:rPr>
+        <w:t xml:space="preserve">esptool</w:t>
+      </w:r>
+      <w:r>
+        <w:rPr>
+          <w:color w:val="1A1A1A"/>
+        </w:rPr>
+        <w:t xml:space="preserve"> identificó un </w:t>
+      </w:r>
+      <w:r>
+        <w:rPr>
+          <w:b/>
+          <w:bCs/>
+          <w:color w:val="1A1A1A"/>
+        </w:rPr>
+        <w:t xml:space="preserve">ESP32‑C6 (QFN40), revisión v0.2</w:t>
+      </w:r>
+      <w:r>
+        <w:rPr>
+          <w:color w:val="1A1A1A"/>
+        </w:rPr>
+        <w:t xml:space="preserve">, y verificó el </w:t>
+      </w:r>
+      <w:r>
+        <w:rPr>
+          <w:i/>
+          <w:iCs/>
+          <w:color w:val="1A1A1A"/>
+        </w:rPr>
+        <w:t xml:space="preserve">hash</w:t>
+      </w:r>
+      <w:r>
+        <w:rPr>
+          <w:color w:val="1A1A1A"/>
+        </w:rPr>
+        <w:t xml:space="preserve"> de cada bloque escrito.</w:t>
+      </w:r>
+    </w:p>
+    <w:p>
+      <w:pPr>
+        <w:spacing w:after="140"/>
+      </w:pPr>
+      <w:r>
+        <w:rPr>
+          <w:color w:val="1A1A1A"/>
+        </w:rPr>
+        <w:t xml:space="preserve">Dos detalles de configuración, documentados en el </w:t>
       </w:r>
       <w:r>
         <w:rPr>
@@ -4440,9 +4536,17 @@
       </w:pPr>
       <w:r>
         <w:rPr>
-          <w:color w:val="1A1A1A"/>
-        </w:rPr>
-        <w:t xml:space="preserve">El C6 necesita </w:t>
+          <w:b/>
+          <w:bCs/>
+          <w:color w:val="1A1A1A"/>
+        </w:rPr>
+        <w:t xml:space="preserve">Conector de la placa.</w:t>
+      </w:r>
+      <w:r>
+        <w:rPr>
+          <w:color w:val="1A1A1A"/>
+        </w:rPr>
+        <w:t xml:space="preserve"> La placa tiene dos conectores USB‑C: «UART», a través de un conversor USB‑serie CH343, y «USB», el USB nativo del chip. La práctica usa el «UART», con </w:t>
       </w:r>
       <w:r>
         <w:rPr>
@@ -4452,13 +4556,13 @@
           <w:szCs w:val="19"/>
           <w:shd w:fill="F2F2EF" w:val="clear"/>
         </w:rPr>
-        <w:t xml:space="preserve">ARDUINO_USB_MODE=1</w:t>
-      </w:r>
-      <w:r>
-        <w:rPr>
-          <w:color w:val="1A1A1A"/>
-        </w:rPr>
-        <w:t xml:space="preserve"> además de </w:t>
+        <w:t xml:space="preserve">ARDUINO_USB_CDC_ON_BOOT=0</w:t>
+      </w:r>
+      <w:r>
+        <w:rPr>
+          <w:color w:val="1A1A1A"/>
+        </w:rPr>
+        <w:t xml:space="preserve">, que es la opción por defecto de Arduino IDE. Para usar el «USB» hay que poner </w:t>
       </w:r>
       <w:r>
         <w:rPr>
@@ -4474,7 +4578,7 @@
         <w:rPr>
           <w:color w:val="1A1A1A"/>
         </w:rPr>
-        <w:t xml:space="preserve"> para que </w:t>
+        <w:t xml:space="preserve">, y el C6 exige además </w:t>
       </w:r>
       <w:r>
         <w:rPr>
@@ -4484,13 +4588,13 @@
           <w:szCs w:val="19"/>
           <w:shd w:fill="F2F2EF" w:val="clear"/>
         </w:rPr>
-        <w:t xml:space="preserve">Serial</w:t>
-      </w:r>
-      <w:r>
-        <w:rPr>
-          <w:color w:val="1A1A1A"/>
-        </w:rPr>
-        <w:t xml:space="preserve"> salga por el USB nativo: su USB es el periférico USB‑Serial/JTAG, no un USB OTG. Sin esa opción el core no compila.</w:t>
+        <w:t xml:space="preserve">ARDUINO_USB_MODE=1</w:t>
+      </w:r>
+      <w:r>
+        <w:rPr>
+          <w:color w:val="1A1A1A"/>
+        </w:rPr>
+        <w:t xml:space="preserve">: su USB nativo es el periférico USB‑Serial/JTAG, no un USB OTG, y sin esa opción el core no compila.</w:t>
       </w:r>
     </w:p>
     <w:p>
@@ -4504,9 +4608,17 @@
       </w:pPr>
       <w:r>
         <w:rPr>
-          <w:color w:val="1A1A1A"/>
-        </w:rPr>
-        <w:t xml:space="preserve">En Windows, las librerías del core 3.3.11 contienen rutas de más de 260 caracteres. Hay que activar las rutas largas de Windows o usar un directorio de PlatformIO con ruta corta.</w:t>
+          <w:b/>
+          <w:bCs/>
+          <w:color w:val="1A1A1A"/>
+        </w:rPr>
+        <w:t xml:space="preserve">Rutas largas en Windows.</w:t>
+      </w:r>
+      <w:r>
+        <w:rPr>
+          <w:color w:val="1A1A1A"/>
+        </w:rPr>
+        <w:t xml:space="preserve"> Las librerías del core 3.3.11 contienen rutas de más de 260 caracteres. Hay que activar las rutas largas de Windows o usar un directorio de PlatformIO con ruta corta.</w:t>
       </w:r>
     </w:p>
     <w:p>
@@ -5373,7 +5485,39 @@
         <w:rPr>
           <w:color w:val="1A1A1A"/>
         </w:rPr>
-        <w:t xml:space="preserve">Protocolo, con el monitor serie abierto a 115200 baudios y la placa conectada por el conector «USB»:</w:t>
+        <w:t xml:space="preserve">Protocolo, con el monitor serie abierto a 115200 baudios y la placa conectada por el conector «UART» (COM5). Los registros completos de la placa están en </w:t>
+      </w:r>
+      <w:r>
+        <w:rPr>
+          <w:rFonts w:ascii="Consolas" w:cs="Consolas" w:eastAsia="Consolas" w:hAnsi="Consolas"/>
+          <w:color w:val="9A3412"/>
+          <w:sz w:val="19"/>
+          <w:szCs w:val="19"/>
+          <w:shd w:fill="F2F2EF" w:val="clear"/>
+        </w:rPr>
+        <w:t xml:space="preserve">docs/evidencias/monitor_arranque.txt</w:t>
+      </w:r>
+      <w:r>
+        <w:rPr>
+          <w:color w:val="1A1A1A"/>
+        </w:rPr>
+        <w:t xml:space="preserve"> y </w:t>
+      </w:r>
+      <w:r>
+        <w:rPr>
+          <w:rFonts w:ascii="Consolas" w:cs="Consolas" w:eastAsia="Consolas" w:hAnsi="Consolas"/>
+          <w:color w:val="9A3412"/>
+          <w:sz w:val="19"/>
+          <w:szCs w:val="19"/>
+          <w:shd w:fill="F2F2EF" w:val="clear"/>
+        </w:rPr>
+        <w:t xml:space="preserve">docs/evidencias/monitor_pulsaciones.txt</w:t>
+      </w:r>
+      <w:r>
+        <w:rPr>
+          <w:color w:val="1A1A1A"/>
+        </w:rPr>
+        <w:t xml:space="preserve">.</w:t>
       </w:r>
     </w:p>
     <w:tbl>
@@ -5627,13 +5771,67 @@
             </w:pPr>
             <w:r>
               <w:rPr>
-                <w:i/>
-                <w:iCs/>
-                <w:color w:val="1A1A1A"/>
-                <w:sz w:val="19"/>
-                <w:szCs w:val="19"/>
-              </w:rPr>
-              <w:t xml:space="preserve">pendiente</w:t>
+                <w:b/>
+                <w:bCs/>
+                <w:color w:val="1A1A1A"/>
+                <w:sz w:val="19"/>
+                <w:szCs w:val="19"/>
+              </w:rPr>
+              <w:t xml:space="preserve">Cumple.</w:t>
+            </w:r>
+            <w:r>
+              <w:rPr>
+                <w:color w:val="1A1A1A"/>
+                <w:sz w:val="19"/>
+                <w:szCs w:val="19"/>
+              </w:rPr>
+              <w:t xml:space="preserve"> </w:t>
+            </w:r>
+            <w:r>
+              <w:rPr>
+                <w:rFonts w:ascii="Consolas" w:cs="Consolas" w:eastAsia="Consolas" w:hAnsi="Consolas"/>
+                <w:color w:val="9A3412"/>
+                <w:sz w:val="19"/>
+                <w:szCs w:val="19"/>
+                <w:shd w:fill="F2F2EF" w:val="clear"/>
+              </w:rPr>
+              <w:t xml:space="preserve">pull-down: ACTIVADO</w:t>
+            </w:r>
+            <w:r>
+              <w:rPr>
+                <w:color w:val="1A1A1A"/>
+                <w:sz w:val="19"/>
+                <w:szCs w:val="19"/>
+              </w:rPr>
+              <w:t xml:space="preserve">, </w:t>
+            </w:r>
+            <w:r>
+              <w:rPr>
+                <w:rFonts w:ascii="Consolas" w:cs="Consolas" w:eastAsia="Consolas" w:hAnsi="Consolas"/>
+                <w:color w:val="9A3412"/>
+                <w:sz w:val="19"/>
+                <w:szCs w:val="19"/>
+                <w:shd w:fill="F2F2EF" w:val="clear"/>
+              </w:rPr>
+              <w:t xml:space="preserve">pull-up: no</w:t>
+            </w:r>
+            <w:r>
+              <w:rPr>
+                <w:color w:val="1A1A1A"/>
+                <w:sz w:val="19"/>
+                <w:szCs w:val="19"/>
+              </w:rPr>
+              <w:t xml:space="preserve">, entrada </w:t>
+            </w:r>
+            <w:r>
+              <w:rPr>
+                <w:rFonts w:ascii="Consolas" w:cs="Consolas" w:eastAsia="Consolas" w:hAnsi="Consolas"/>
+                <w:color w:val="9A3412"/>
+                <w:sz w:val="19"/>
+                <w:szCs w:val="19"/>
+                <w:shd w:fill="F2F2EF" w:val="clear"/>
+              </w:rPr>
+              <w:t xml:space="preserve">0</w:t>
             </w:r>
           </w:p>
         </w:tc>
@@ -5730,13 +5928,39 @@
             </w:pPr>
             <w:r>
               <w:rPr>
+                <w:color w:val="1A1A1A"/>
+                <w:sz w:val="19"/>
+                <w:szCs w:val="19"/>
+              </w:rPr>
+              <w:t xml:space="preserve">Secuencia ejecutada (</w:t>
+            </w:r>
+            <w:r>
+              <w:rPr>
+                <w:rFonts w:ascii="Consolas" w:cs="Consolas" w:eastAsia="Consolas" w:hAnsi="Consolas"/>
+                <w:color w:val="9A3412"/>
+                <w:sz w:val="19"/>
+                <w:szCs w:val="19"/>
+                <w:shd w:fill="F2F2EF" w:val="clear"/>
+              </w:rPr>
+              <w:t xml:space="preserve">rojo... verde... azul... ok</w:t>
+            </w:r>
+            <w:r>
+              <w:rPr>
+                <w:color w:val="1A1A1A"/>
+                <w:sz w:val="19"/>
+                <w:szCs w:val="19"/>
+              </w:rPr>
+              <w:t xml:space="preserve">); </w:t>
+            </w:r>
+            <w:r>
+              <w:rPr>
                 <w:i/>
                 <w:iCs/>
                 <w:color w:val="1A1A1A"/>
                 <w:sz w:val="19"/>
                 <w:szCs w:val="19"/>
               </w:rPr>
-              <w:t xml:space="preserve">pendiente</w:t>
+              <w:t xml:space="preserve">colores: pendiente de confirmar a la vista</w:t>
             </w:r>
           </w:p>
         </w:tc>
@@ -5833,13 +6057,21 @@
             </w:pPr>
             <w:r>
               <w:rPr>
-                <w:i/>
-                <w:iCs/>
-                <w:color w:val="1A1A1A"/>
-                <w:sz w:val="19"/>
-                <w:szCs w:val="19"/>
-              </w:rPr>
-              <w:t xml:space="preserve">pendiente</w:t>
+                <w:b/>
+                <w:bCs/>
+                <w:color w:val="1A1A1A"/>
+                <w:sz w:val="19"/>
+                <w:szCs w:val="19"/>
+              </w:rPr>
+              <w:t xml:space="preserve">Cumple.</w:t>
+            </w:r>
+            <w:r>
+              <w:rPr>
+                <w:color w:val="1A1A1A"/>
+                <w:sz w:val="19"/>
+                <w:szCs w:val="19"/>
+              </w:rPr>
+              <w:t xml:space="preserve"> LED apagado (foto); ninguna línea en ningún tramo de reposo, el más largo de 16,1 s</w:t>
             </w:r>
           </w:p>
         </w:tc>
@@ -5946,13 +6178,57 @@
             </w:pPr>
             <w:r>
               <w:rPr>
-                <w:i/>
-                <w:iCs/>
-                <w:color w:val="1A1A1A"/>
-                <w:sz w:val="19"/>
-                <w:szCs w:val="19"/>
-              </w:rPr>
-              <w:t xml:space="preserve">pendiente</w:t>
+                <w:b/>
+                <w:bCs/>
+                <w:color w:val="1A1A1A"/>
+                <w:sz w:val="19"/>
+                <w:szCs w:val="19"/>
+              </w:rPr>
+              <w:t xml:space="preserve">Cumple.</w:t>
+            </w:r>
+            <w:r>
+              <w:rPr>
+                <w:color w:val="1A1A1A"/>
+                <w:sz w:val="19"/>
+                <w:szCs w:val="19"/>
+              </w:rPr>
+              <w:t xml:space="preserve"> LED encendido en verde al presionar (foto); una línea </w:t>
+            </w:r>
+            <w:r>
+              <w:rPr>
+                <w:rFonts w:ascii="Consolas" w:cs="Consolas" w:eastAsia="Consolas" w:hAnsi="Consolas"/>
+                <w:color w:val="9A3412"/>
+                <w:sz w:val="19"/>
+                <w:szCs w:val="19"/>
+                <w:shd w:fill="F2F2EF" w:val="clear"/>
+              </w:rPr>
+              <w:t xml:space="preserve">PRESIONADO</w:t>
+            </w:r>
+            <w:r>
+              <w:rPr>
+                <w:color w:val="1A1A1A"/>
+                <w:sz w:val="19"/>
+                <w:szCs w:val="19"/>
+              </w:rPr>
+              <w:t xml:space="preserve"> y su </w:t>
+            </w:r>
+            <w:r>
+              <w:rPr>
+                <w:rFonts w:ascii="Consolas" w:cs="Consolas" w:eastAsia="Consolas" w:hAnsi="Consolas"/>
+                <w:color w:val="9A3412"/>
+                <w:sz w:val="19"/>
+                <w:szCs w:val="19"/>
+                <w:shd w:fill="F2F2EF" w:val="clear"/>
+              </w:rPr>
+              <w:t xml:space="preserve">SUELTO</w:t>
+            </w:r>
+            <w:r>
+              <w:rPr>
+                <w:color w:val="1A1A1A"/>
+                <w:sz w:val="19"/>
+                <w:szCs w:val="19"/>
+              </w:rPr>
+              <w:t xml:space="preserve"> por pulsación</w:t>
             </w:r>
           </w:p>
         </w:tc>
@@ -6077,13 +6353,39 @@
             </w:pPr>
             <w:r>
               <w:rPr>
-                <w:i/>
-                <w:iCs/>
-                <w:color w:val="1A1A1A"/>
-                <w:sz w:val="19"/>
-                <w:szCs w:val="19"/>
-              </w:rPr>
-              <w:t xml:space="preserve">pendiente</w:t>
+                <w:b/>
+                <w:bCs/>
+                <w:color w:val="1A1A1A"/>
+                <w:sz w:val="19"/>
+                <w:szCs w:val="19"/>
+              </w:rPr>
+              <w:t xml:space="preserve">Cumple.</w:t>
+            </w:r>
+            <w:r>
+              <w:rPr>
+                <w:color w:val="1A1A1A"/>
+                <w:sz w:val="19"/>
+                <w:szCs w:val="19"/>
+              </w:rPr>
+              <w:t xml:space="preserve"> Se hicieron 37, numeradas del 1 al 37 sin saltos; </w:t>
+            </w:r>
+            <w:r>
+              <w:rPr>
+                <w:rFonts w:ascii="Consolas" w:cs="Consolas" w:eastAsia="Consolas" w:hAnsi="Consolas"/>
+                <w:color w:val="9A3412"/>
+                <w:sz w:val="19"/>
+                <w:szCs w:val="19"/>
+                <w:shd w:fill="F2F2EF" w:val="clear"/>
+              </w:rPr>
+              <w:t xml:space="preserve">cambios leidos: 1</w:t>
+            </w:r>
+            <w:r>
+              <w:rPr>
+                <w:color w:val="1A1A1A"/>
+                <w:sz w:val="19"/>
+                <w:szCs w:val="19"/>
+              </w:rPr>
+              <w:t xml:space="preserve"> en las 74 transiciones</w:t>
             </w:r>
           </w:p>
         </w:tc>
@@ -6198,13 +6500,21 @@
             </w:pPr>
             <w:r>
               <w:rPr>
-                <w:i/>
-                <w:iCs/>
-                <w:color w:val="1A1A1A"/>
-                <w:sz w:val="19"/>
-                <w:szCs w:val="19"/>
-              </w:rPr>
-              <w:t xml:space="preserve">pendiente</w:t>
+                <w:b/>
+                <w:bCs/>
+                <w:color w:val="1A1A1A"/>
+                <w:sz w:val="19"/>
+                <w:szCs w:val="19"/>
+              </w:rPr>
+              <w:t xml:space="preserve">Cumple.</w:t>
+            </w:r>
+            <w:r>
+              <w:rPr>
+                <w:color w:val="1A1A1A"/>
+                <w:sz w:val="19"/>
+                <w:szCs w:val="19"/>
+              </w:rPr>
+              <w:t xml:space="preserve"> Pulsación más larga de 4106 ms, con un solo cambio: la entrada no se interrumpió</w:t>
             </w:r>
           </w:p>
         </w:tc>
@@ -6383,6 +6693,460 @@
           <w:color w:val="1A1A1A"/>
         </w:rPr>
         <w:t xml:space="preserve"> de los rebotes reales.</w:t>
+      </w:r>
+    </w:p>
+    <w:p>
+      <w:pPr>
+        <w:spacing w:after="140"/>
+      </w:pPr>
+      <w:r>
+        <w:rPr>
+          <w:color w:val="1A1A1A"/>
+        </w:rPr>
+        <w:t xml:space="preserve">Resumen del registro de pulsaciones:</w:t>
+      </w:r>
+    </w:p>
+    <w:tbl>
+      <w:tblPr>
+        <w:tblW w:type="dxa" w:w="9026"/>
+        <w:tblBorders>
+          <w:top w:val="single" w:color="C9C8C0" w:sz="2"/>
+          <w:left w:val="single" w:color="C9C8C0" w:sz="2"/>
+          <w:bottom w:val="single" w:color="C9C8C0" w:sz="2"/>
+          <w:right w:val="single" w:color="C9C8C0" w:sz="2"/>
+          <w:insideH w:val="single" w:color="C9C8C0" w:sz="2"/>
+          <w:insideV w:val="single" w:color="C9C8C0" w:sz="2"/>
+        </w:tblBorders>
+      </w:tblPr>
+      <w:tblGrid>
+        <w:gridCol w:w="4513"/>
+        <w:gridCol w:w="4513"/>
+      </w:tblGrid>
+      <w:tr>
+        <w:trPr>
+          <w:tblHeader/>
+        </w:trPr>
+        <w:tc>
+          <w:tcPr>
+            <w:tcW w:type="dxa" w:w="4513"/>
+            <w:shd w:fill="E8ECF3" w:val="clear"/>
+            <w:tcMar>
+              <w:top w:type="dxa" w:w="80"/>
+              <w:left w:type="dxa" w:w="110"/>
+              <w:bottom w:type="dxa" w:w="80"/>
+              <w:right w:type="dxa" w:w="110"/>
+            </w:tcMar>
+          </w:tcPr>
+          <w:p>
+            <w:pPr>
+              <w:spacing w:after="0"/>
+            </w:pPr>
+            <w:r>
+              <w:rPr>
+                <w:b/>
+                <w:bCs/>
+                <w:color w:val="1A1A1A"/>
+                <w:sz w:val="19"/>
+                <w:szCs w:val="19"/>
+              </w:rPr>
+              <w:t xml:space="preserve">Magnitud</w:t>
+            </w:r>
+          </w:p>
+        </w:tc>
+        <w:tc>
+          <w:tcPr>
+            <w:tcW w:type="dxa" w:w="4513"/>
+            <w:shd w:fill="E8ECF3" w:val="clear"/>
+            <w:tcMar>
+              <w:top w:type="dxa" w:w="80"/>
+              <w:left w:type="dxa" w:w="110"/>
+              <w:bottom w:type="dxa" w:w="80"/>
+              <w:right w:type="dxa" w:w="110"/>
+            </w:tcMar>
+          </w:tcPr>
+          <w:p>
+            <w:pPr>
+              <w:spacing w:after="0"/>
+            </w:pPr>
+            <w:r>
+              <w:rPr>
+                <w:b/>
+                <w:bCs/>
+                <w:color w:val="1A1A1A"/>
+                <w:sz w:val="19"/>
+                <w:szCs w:val="19"/>
+              </w:rPr>
+              <w:t xml:space="preserve">Valor</w:t>
+            </w:r>
+          </w:p>
+        </w:tc>
+      </w:tr>
+      <w:tr>
+        <w:trPr>
+          <w:tblHeader w:val="false"/>
+        </w:trPr>
+        <w:tc>
+          <w:tcPr>
+            <w:tcW w:type="dxa" w:w="4513"/>
+            <w:tcMar>
+              <w:top w:type="dxa" w:w="80"/>
+              <w:left w:type="dxa" w:w="110"/>
+              <w:bottom w:type="dxa" w:w="80"/>
+              <w:right w:type="dxa" w:w="110"/>
+            </w:tcMar>
+          </w:tcPr>
+          <w:p>
+            <w:pPr>
+              <w:spacing w:after="0"/>
+            </w:pPr>
+            <w:r>
+              <w:rPr>
+                <w:color w:val="1A1A1A"/>
+                <w:sz w:val="19"/>
+                <w:szCs w:val="19"/>
+              </w:rPr>
+              <w:t xml:space="preserve">Pulsaciones registradas</w:t>
+            </w:r>
+          </w:p>
+        </w:tc>
+        <w:tc>
+          <w:tcPr>
+            <w:tcW w:type="dxa" w:w="4513"/>
+            <w:tcMar>
+              <w:top w:type="dxa" w:w="80"/>
+              <w:left w:type="dxa" w:w="110"/>
+              <w:bottom w:type="dxa" w:w="80"/>
+              <w:right w:type="dxa" w:w="110"/>
+            </w:tcMar>
+          </w:tcPr>
+          <w:p>
+            <w:pPr>
+              <w:spacing w:after="0"/>
+            </w:pPr>
+            <w:r>
+              <w:rPr>
+                <w:color w:val="1A1A1A"/>
+                <w:sz w:val="19"/>
+                <w:szCs w:val="19"/>
+              </w:rPr>
+              <w:t xml:space="preserve">37, numeradas del 1 al 37 sin saltos</w:t>
+            </w:r>
+          </w:p>
+        </w:tc>
+      </w:tr>
+      <w:tr>
+        <w:trPr>
+          <w:tblHeader w:val="false"/>
+        </w:trPr>
+        <w:tc>
+          <w:tcPr>
+            <w:tcW w:type="dxa" w:w="4513"/>
+            <w:tcMar>
+              <w:top w:type="dxa" w:w="80"/>
+              <w:left w:type="dxa" w:w="110"/>
+              <w:bottom w:type="dxa" w:w="80"/>
+              <w:right w:type="dxa" w:w="110"/>
+            </w:tcMar>
+          </w:tcPr>
+          <w:p>
+            <w:pPr>
+              <w:spacing w:after="0"/>
+            </w:pPr>
+            <w:r>
+              <w:rPr>
+                <w:color w:val="1A1A1A"/>
+                <w:sz w:val="19"/>
+                <w:szCs w:val="19"/>
+              </w:rPr>
+              <w:t xml:space="preserve">Transiciones con rebote detectado</w:t>
+            </w:r>
+          </w:p>
+        </w:tc>
+        <w:tc>
+          <w:tcPr>
+            <w:tcW w:type="dxa" w:w="4513"/>
+            <w:tcMar>
+              <w:top w:type="dxa" w:w="80"/>
+              <w:left w:type="dxa" w:w="110"/>
+              <w:bottom w:type="dxa" w:w="80"/>
+              <w:right w:type="dxa" w:w="110"/>
+            </w:tcMar>
+          </w:tcPr>
+          <w:p>
+            <w:pPr>
+              <w:spacing w:after="0"/>
+            </w:pPr>
+            <w:r>
+              <w:rPr>
+                <w:color w:val="1A1A1A"/>
+                <w:sz w:val="19"/>
+                <w:szCs w:val="19"/>
+              </w:rPr>
+              <w:t xml:space="preserve">0 de 74</w:t>
+            </w:r>
+          </w:p>
+        </w:tc>
+      </w:tr>
+      <w:tr>
+        <w:trPr>
+          <w:tblHeader w:val="false"/>
+        </w:trPr>
+        <w:tc>
+          <w:tcPr>
+            <w:tcW w:type="dxa" w:w="4513"/>
+            <w:tcMar>
+              <w:top w:type="dxa" w:w="80"/>
+              <w:left w:type="dxa" w:w="110"/>
+              <w:bottom w:type="dxa" w:w="80"/>
+              <w:right w:type="dxa" w:w="110"/>
+            </w:tcMar>
+          </w:tcPr>
+          <w:p>
+            <w:pPr>
+              <w:spacing w:after="0"/>
+            </w:pPr>
+            <w:r>
+              <w:rPr>
+                <w:color w:val="1A1A1A"/>
+                <w:sz w:val="19"/>
+                <w:szCs w:val="19"/>
+              </w:rPr>
+              <w:t xml:space="preserve">Pulsos espurios o descartados</w:t>
+            </w:r>
+          </w:p>
+        </w:tc>
+        <w:tc>
+          <w:tcPr>
+            <w:tcW w:type="dxa" w:w="4513"/>
+            <w:tcMar>
+              <w:top w:type="dxa" w:w="80"/>
+              <w:left w:type="dxa" w:w="110"/>
+              <w:bottom w:type="dxa" w:w="80"/>
+              <w:right w:type="dxa" w:w="110"/>
+            </w:tcMar>
+          </w:tcPr>
+          <w:p>
+            <w:pPr>
+              <w:spacing w:after="0"/>
+            </w:pPr>
+            <w:r>
+              <w:rPr>
+                <w:color w:val="1A1A1A"/>
+                <w:sz w:val="19"/>
+                <w:szCs w:val="19"/>
+              </w:rPr>
+              <w:t xml:space="preserve">0</w:t>
+            </w:r>
+          </w:p>
+        </w:tc>
+      </w:tr>
+      <w:tr>
+        <w:trPr>
+          <w:tblHeader w:val="false"/>
+        </w:trPr>
+        <w:tc>
+          <w:tcPr>
+            <w:tcW w:type="dxa" w:w="4513"/>
+            <w:tcMar>
+              <w:top w:type="dxa" w:w="80"/>
+              <w:left w:type="dxa" w:w="110"/>
+              <w:bottom w:type="dxa" w:w="80"/>
+              <w:right w:type="dxa" w:w="110"/>
+            </w:tcMar>
+          </w:tcPr>
+          <w:p>
+            <w:pPr>
+              <w:spacing w:after="0"/>
+            </w:pPr>
+            <w:r>
+              <w:rPr>
+                <w:color w:val="1A1A1A"/>
+                <w:sz w:val="19"/>
+                <w:szCs w:val="19"/>
+              </w:rPr>
+              <w:t xml:space="preserve">Reposo más largo sin ningún evento</w:t>
+            </w:r>
+          </w:p>
+        </w:tc>
+        <w:tc>
+          <w:tcPr>
+            <w:tcW w:type="dxa" w:w="4513"/>
+            <w:tcMar>
+              <w:top w:type="dxa" w:w="80"/>
+              <w:left w:type="dxa" w:w="110"/>
+              <w:bottom w:type="dxa" w:w="80"/>
+              <w:right w:type="dxa" w:w="110"/>
+            </w:tcMar>
+          </w:tcPr>
+          <w:p>
+            <w:pPr>
+              <w:spacing w:after="0"/>
+            </w:pPr>
+            <w:r>
+              <w:rPr>
+                <w:color w:val="1A1A1A"/>
+                <w:sz w:val="19"/>
+                <w:szCs w:val="19"/>
+              </w:rPr>
+              <w:t xml:space="preserve">16,1 s</w:t>
+            </w:r>
+          </w:p>
+        </w:tc>
+      </w:tr>
+      <w:tr>
+        <w:trPr>
+          <w:tblHeader w:val="false"/>
+        </w:trPr>
+        <w:tc>
+          <w:tcPr>
+            <w:tcW w:type="dxa" w:w="4513"/>
+            <w:tcMar>
+              <w:top w:type="dxa" w:w="80"/>
+              <w:left w:type="dxa" w:w="110"/>
+              <w:bottom w:type="dxa" w:w="80"/>
+              <w:right w:type="dxa" w:w="110"/>
+            </w:tcMar>
+          </w:tcPr>
+          <w:p>
+            <w:pPr>
+              <w:spacing w:after="0"/>
+            </w:pPr>
+            <w:r>
+              <w:rPr>
+                <w:color w:val="1A1A1A"/>
+                <w:sz w:val="19"/>
+                <w:szCs w:val="19"/>
+              </w:rPr>
+              <w:t xml:space="preserve">Duración de las pulsaciones: mínima / mediana / máxima</w:t>
+            </w:r>
+          </w:p>
+        </w:tc>
+        <w:tc>
+          <w:tcPr>
+            <w:tcW w:type="dxa" w:w="4513"/>
+            <w:tcMar>
+              <w:top w:type="dxa" w:w="80"/>
+              <w:left w:type="dxa" w:w="110"/>
+              <w:bottom w:type="dxa" w:w="80"/>
+              <w:right w:type="dxa" w:w="110"/>
+            </w:tcMar>
+          </w:tcPr>
+          <w:p>
+            <w:pPr>
+              <w:spacing w:after="0"/>
+            </w:pPr>
+            <w:r>
+              <w:rPr>
+                <w:color w:val="1A1A1A"/>
+                <w:sz w:val="19"/>
+                <w:szCs w:val="19"/>
+              </w:rPr>
+              <w:t xml:space="preserve">49 / 74 / 4106 ms</w:t>
+            </w:r>
+          </w:p>
+        </w:tc>
+      </w:tr>
+      <w:tr>
+        <w:trPr>
+          <w:tblHeader w:val="false"/>
+        </w:trPr>
+        <w:tc>
+          <w:tcPr>
+            <w:tcW w:type="dxa" w:w="4513"/>
+            <w:tcMar>
+              <w:top w:type="dxa" w:w="80"/>
+              <w:left w:type="dxa" w:w="110"/>
+              <w:bottom w:type="dxa" w:w="80"/>
+              <w:right w:type="dxa" w:w="110"/>
+            </w:tcMar>
+          </w:tcPr>
+          <w:p>
+            <w:pPr>
+              <w:spacing w:after="0"/>
+            </w:pPr>
+            <w:r>
+              <w:rPr>
+                <w:color w:val="1A1A1A"/>
+                <w:sz w:val="19"/>
+                <w:szCs w:val="19"/>
+              </w:rPr>
+              <w:t xml:space="preserve">Ritmo más rápido</w:t>
+            </w:r>
+          </w:p>
+        </w:tc>
+        <w:tc>
+          <w:tcPr>
+            <w:tcW w:type="dxa" w:w="4513"/>
+            <w:tcMar>
+              <w:top w:type="dxa" w:w="80"/>
+              <w:left w:type="dxa" w:w="110"/>
+              <w:bottom w:type="dxa" w:w="80"/>
+              <w:right w:type="dxa" w:w="110"/>
+            </w:tcMar>
+          </w:tcPr>
+          <w:p>
+            <w:pPr>
+              <w:spacing w:after="0"/>
+            </w:pPr>
+            <w:r>
+              <w:rPr>
+                <w:color w:val="1A1A1A"/>
+                <w:sz w:val="19"/>
+                <w:szCs w:val="19"/>
+              </w:rPr>
+              <w:t xml:space="preserve">22 pulsaciones en 3,2 s (6,5 por segundo), todas registradas</w:t>
+            </w:r>
+          </w:p>
+        </w:tc>
+      </w:tr>
+    </w:tbl>
+    <w:p>
+      <w:pPr>
+        <w:spacing w:after="180"/>
+      </w:pPr>
+    </w:p>
+    <w:p>
+      <w:pPr>
+        <w:spacing w:after="140"/>
+      </w:pPr>
+      <w:r>
+        <w:rPr>
+          <w:b/>
+          <w:bCs/>
+          <w:color w:val="1A1A1A"/>
+        </w:rPr>
+        <w:t xml:space="preserve">Lectura.</w:t>
+      </w:r>
+      <w:r>
+        <w:rPr>
+          <w:color w:val="1A1A1A"/>
+        </w:rPr>
+        <w:t xml:space="preserve"> Con la resistencia pull-down interna, la entrada se comporta en la placa exactamente como con la física: nivel bajo estable en reposo, sin un solo evento que nadie haya provocado, y una pulsación registrada por cada pulsación real, incluso a 6,5 por segundo.</w:t>
+      </w:r>
+    </w:p>
+    <w:p>
+      <w:pPr>
+        <w:spacing w:after="140"/>
+      </w:pPr>
+      <w:r>
+        <w:rPr>
+          <w:color w:val="1A1A1A"/>
+        </w:rPr>
+        <w:t xml:space="preserve">Un resultado que no se esperaba: el pulsador </w:t>
+      </w:r>
+      <w:r>
+        <w:rPr>
+          <w:b/>
+          <w:bCs/>
+          <w:color w:val="1A1A1A"/>
+        </w:rPr>
+        <w:t xml:space="preserve">no mostró rebotes</w:t>
+      </w:r>
+      <w:r>
+        <w:rPr>
+          <w:color w:val="1A1A1A"/>
+        </w:rPr>
+        <w:t xml:space="preserve"> en ninguna de las 74 transiciones. Eso no demuestra que el contacto no rebote, porque un rebote de menos de 1 ms puede caer entre dos lecturas. Sí demuestra que, con este pulsador y leyendo cada milisegundo, el antirrebote de 30 ms no tuvo nada que filtrar. Tampoco recortó ninguna pulsación: la más corta duró 49 ms, por encima de ese umbral.</w:t>
       </w:r>
     </w:p>
     <w:p>
@@ -6523,249 +7287,253 @@
         <w:t xml:space="preserve">Evidencias:</w:t>
       </w:r>
     </w:p>
-    <w:tbl>
-      <w:tblPr>
-        <w:tblW w:type="dxa" w:w="9026"/>
-        <w:tblBorders>
-          <w:top w:val="single" w:color="E0A100" w:sz="2"/>
-          <w:left w:val="single" w:color="E0A100" w:sz="2"/>
-          <w:bottom w:val="single" w:color="E0A100" w:sz="2"/>
-          <w:right w:val="single" w:color="E0A100" w:sz="2"/>
-          <w:insideH w:val="single" w:color="E0A100" w:sz="2"/>
-          <w:insideV w:val="single" w:color="E0A100" w:sz="2"/>
-        </w:tblBorders>
-      </w:tblPr>
-      <w:tblGrid>
-        <w:gridCol w:w="9026"/>
-      </w:tblGrid>
-      <w:tr>
-        <w:tc>
-          <w:tcPr>
-            <w:tcW w:type="dxa" w:w="9026"/>
-            <w:shd w:fill="FFF8E1" w:val="clear"/>
-            <w:tcMar>
-              <w:top w:type="dxa" w:w="260"/>
-              <w:left w:type="dxa" w:w="200"/>
-              <w:bottom w:type="dxa" w:w="260"/>
-              <w:right w:type="dxa" w:w="200"/>
-            </w:tcMar>
-          </w:tcPr>
-          <w:p>
-            <w:pPr>
-              <w:jc w:val="center"/>
-            </w:pPr>
-            <w:r>
-              <w:rPr>
-                <w:b/>
-                <w:bCs/>
-                <w:color w:val="8A6100"/>
-              </w:rPr>
-              <w:t xml:space="preserve">EVIDENCIA PENDIENTE: Montaje en la protoboard</w:t>
-            </w:r>
-          </w:p>
-          <w:p>
-            <w:pPr>
-              <w:jc w:val="center"/>
-            </w:pPr>
-            <w:r>
-              <w:rPr>
-                <w:color w:val="8A6100"/>
-                <w:sz w:val="17"/>
-                <w:szCs w:val="17"/>
-              </w:rPr>
-              <w:t xml:space="preserve">docs/evidencias/foto_montaje.jpg</w:t>
-            </w:r>
-          </w:p>
-        </w:tc>
-      </w:tr>
-    </w:tbl>
     <w:p>
       <w:pPr>
-        <w:spacing w:after="180"/>
-      </w:pPr>
+        <w:spacing w:after="60" w:before="160"/>
+        <w:jc w:val="center"/>
+      </w:pPr>
+      <w:r>
+        <w:drawing>
+          <wp:inline distT="0" distB="0" distL="0" distR="0">
+            <wp:extent cx="3000375" cy="4000500"/>
+            <wp:effectExtent t="0" r="0" b="0" l="0"/>
+            <wp:docPr id="1" name="" descr="" title=""/>
+            <wp:cNvGraphicFramePr>
+              <a:graphicFrameLocks xmlns:a="http://schemas.openxmlformats.org/drawingml/2006/main" noChangeAspect="1"/>
+            </wp:cNvGraphicFramePr>
+            <a:graphic xmlns:a="http://schemas.openxmlformats.org/drawingml/2006/main">
+              <a:graphicData uri="http://schemas.openxmlformats.org/drawingml/2006/picture">
+                <pic:pic xmlns:pic="http://schemas.openxmlformats.org/drawingml/2006/picture">
+                  <pic:nvPicPr>
+                    <pic:cNvPr id="0" name="" descr=""/>
+                    <pic:cNvPicPr>
+                      <a:picLocks noChangeAspect="1" noChangeArrowheads="1"/>
+                    </pic:cNvPicPr>
+                  </pic:nvPicPr>
+                  <pic:blipFill>
+                    <a:blip r:embed="rId11" cstate="none"/>
+                    <a:srcRect/>
+                    <a:stretch>
+                      <a:fillRect/>
+                    </a:stretch>
+                  </pic:blipFill>
+                  <pic:spPr bwMode="auto">
+                    <a:xfrm>
+                      <a:off x="0" y="0"/>
+                      <a:ext cx="3000375" cy="4000500"/>
+                    </a:xfrm>
+                    <a:prstGeom prst="rect">
+                      <a:avLst/>
+                    </a:prstGeom>
+                  </pic:spPr>
+                </pic:pic>
+              </a:graphicData>
+            </a:graphic>
+          </wp:inline>
+        </w:drawing>
+      </w:r>
     </w:p>
-    <w:tbl>
-      <w:tblPr>
-        <w:tblW w:type="dxa" w:w="9026"/>
-        <w:tblBorders>
-          <w:top w:val="single" w:color="E0A100" w:sz="2"/>
-          <w:left w:val="single" w:color="E0A100" w:sz="2"/>
-          <w:bottom w:val="single" w:color="E0A100" w:sz="2"/>
-          <w:right w:val="single" w:color="E0A100" w:sz="2"/>
-          <w:insideH w:val="single" w:color="E0A100" w:sz="2"/>
-          <w:insideV w:val="single" w:color="E0A100" w:sz="2"/>
-        </w:tblBorders>
-      </w:tblPr>
-      <w:tblGrid>
-        <w:gridCol w:w="9026"/>
-      </w:tblGrid>
-      <w:tr>
-        <w:tc>
-          <w:tcPr>
-            <w:tcW w:type="dxa" w:w="9026"/>
-            <w:shd w:fill="FFF8E1" w:val="clear"/>
-            <w:tcMar>
-              <w:top w:type="dxa" w:w="260"/>
-              <w:left w:type="dxa" w:w="200"/>
-              <w:bottom w:type="dxa" w:w="260"/>
-              <w:right w:type="dxa" w:w="200"/>
-            </w:tcMar>
-          </w:tcPr>
-          <w:p>
-            <w:pPr>
-              <w:jc w:val="center"/>
-            </w:pPr>
-            <w:r>
-              <w:rPr>
-                <w:b/>
-                <w:bCs/>
-                <w:color w:val="8A6100"/>
-              </w:rPr>
-              <w:t xml:space="preserve">EVIDENCIA PENDIENTE: Pulsador suelto: LED apagado</w:t>
-            </w:r>
-          </w:p>
-          <w:p>
-            <w:pPr>
-              <w:jc w:val="center"/>
-            </w:pPr>
-            <w:r>
-              <w:rPr>
-                <w:color w:val="8A6100"/>
-                <w:sz w:val="17"/>
-                <w:szCs w:val="17"/>
-              </w:rPr>
-              <w:t xml:space="preserve">docs/evidencias/foto_led_apagado.jpg</w:t>
-            </w:r>
-          </w:p>
-        </w:tc>
-      </w:tr>
-    </w:tbl>
     <w:p>
       <w:pPr>
-        <w:spacing w:after="180"/>
-      </w:pPr>
+        <w:spacing w:after="220"/>
+        <w:jc w:val="center"/>
+      </w:pPr>
+      <w:r>
+        <w:rPr>
+          <w:i/>
+          <w:iCs/>
+          <w:color w:val="52514E"/>
+          <w:sz w:val="17"/>
+          <w:szCs w:val="17"/>
+        </w:rPr>
+        <w:t xml:space="preserve">Montaje en la protoboard, vista superior: placa ESP32-C6 alimentada por el conector CH343 (UART), pulsador y módulo LED RGB, sin ninguna resistencia</w:t>
+      </w:r>
     </w:p>
-    <w:tbl>
-      <w:tblPr>
-        <w:tblW w:type="dxa" w:w="9026"/>
-        <w:tblBorders>
-          <w:top w:val="single" w:color="E0A100" w:sz="2"/>
-          <w:left w:val="single" w:color="E0A100" w:sz="2"/>
-          <w:bottom w:val="single" w:color="E0A100" w:sz="2"/>
-          <w:right w:val="single" w:color="E0A100" w:sz="2"/>
-          <w:insideH w:val="single" w:color="E0A100" w:sz="2"/>
-          <w:insideV w:val="single" w:color="E0A100" w:sz="2"/>
-        </w:tblBorders>
-      </w:tblPr>
-      <w:tblGrid>
-        <w:gridCol w:w="9026"/>
-      </w:tblGrid>
-      <w:tr>
-        <w:tc>
-          <w:tcPr>
-            <w:tcW w:type="dxa" w:w="9026"/>
-            <w:shd w:fill="FFF8E1" w:val="clear"/>
-            <w:tcMar>
-              <w:top w:type="dxa" w:w="260"/>
-              <w:left w:type="dxa" w:w="200"/>
-              <w:bottom w:type="dxa" w:w="260"/>
-              <w:right w:type="dxa" w:w="200"/>
-            </w:tcMar>
-          </w:tcPr>
-          <w:p>
-            <w:pPr>
-              <w:jc w:val="center"/>
-            </w:pPr>
-            <w:r>
-              <w:rPr>
-                <w:b/>
-                <w:bCs/>
-                <w:color w:val="8A6100"/>
-              </w:rPr>
-              <w:t xml:space="preserve">EVIDENCIA PENDIENTE: Pulsador presionado: LED encendido</w:t>
-            </w:r>
-          </w:p>
-          <w:p>
-            <w:pPr>
-              <w:jc w:val="center"/>
-            </w:pPr>
-            <w:r>
-              <w:rPr>
-                <w:color w:val="8A6100"/>
-                <w:sz w:val="17"/>
-                <w:szCs w:val="17"/>
-              </w:rPr>
-              <w:t xml:space="preserve">docs/evidencias/foto_led_encendido.jpg</w:t>
-            </w:r>
-          </w:p>
-        </w:tc>
-      </w:tr>
-    </w:tbl>
     <w:p>
       <w:pPr>
-        <w:spacing w:after="180"/>
-      </w:pPr>
+        <w:spacing w:after="60" w:before="160"/>
+        <w:jc w:val="center"/>
+      </w:pPr>
+      <w:r>
+        <w:drawing>
+          <wp:inline distT="0" distB="0" distL="0" distR="0">
+            <wp:extent cx="2771775" cy="4000500"/>
+            <wp:effectExtent t="0" r="0" b="0" l="0"/>
+            <wp:docPr id="1" name="" descr="" title=""/>
+            <wp:cNvGraphicFramePr>
+              <a:graphicFrameLocks xmlns:a="http://schemas.openxmlformats.org/drawingml/2006/main" noChangeAspect="1"/>
+            </wp:cNvGraphicFramePr>
+            <a:graphic xmlns:a="http://schemas.openxmlformats.org/drawingml/2006/main">
+              <a:graphicData uri="http://schemas.openxmlformats.org/drawingml/2006/picture">
+                <pic:pic xmlns:pic="http://schemas.openxmlformats.org/drawingml/2006/picture">
+                  <pic:nvPicPr>
+                    <pic:cNvPr id="0" name="" descr=""/>
+                    <pic:cNvPicPr>
+                      <a:picLocks noChangeAspect="1" noChangeArrowheads="1"/>
+                    </pic:cNvPicPr>
+                  </pic:nvPicPr>
+                  <pic:blipFill>
+                    <a:blip r:embed="rId12" cstate="none"/>
+                    <a:srcRect/>
+                    <a:stretch>
+                      <a:fillRect/>
+                    </a:stretch>
+                  </pic:blipFill>
+                  <pic:spPr bwMode="auto">
+                    <a:xfrm>
+                      <a:off x="0" y="0"/>
+                      <a:ext cx="2771775" cy="4000500"/>
+                    </a:xfrm>
+                    <a:prstGeom prst="rect">
+                      <a:avLst/>
+                    </a:prstGeom>
+                  </pic:spPr>
+                </pic:pic>
+              </a:graphicData>
+            </a:graphic>
+          </wp:inline>
+        </w:drawing>
+      </w:r>
     </w:p>
-    <w:tbl>
-      <w:tblPr>
-        <w:tblW w:type="dxa" w:w="9026"/>
-        <w:tblBorders>
-          <w:top w:val="single" w:color="E0A100" w:sz="2"/>
-          <w:left w:val="single" w:color="E0A100" w:sz="2"/>
-          <w:bottom w:val="single" w:color="E0A100" w:sz="2"/>
-          <w:right w:val="single" w:color="E0A100" w:sz="2"/>
-          <w:insideH w:val="single" w:color="E0A100" w:sz="2"/>
-          <w:insideV w:val="single" w:color="E0A100" w:sz="2"/>
-        </w:tblBorders>
-      </w:tblPr>
-      <w:tblGrid>
-        <w:gridCol w:w="9026"/>
-      </w:tblGrid>
-      <w:tr>
-        <w:tc>
-          <w:tcPr>
-            <w:tcW w:type="dxa" w:w="9026"/>
-            <w:shd w:fill="FFF8E1" w:val="clear"/>
-            <w:tcMar>
-              <w:top w:type="dxa" w:w="260"/>
-              <w:left w:type="dxa" w:w="200"/>
-              <w:bottom w:type="dxa" w:w="260"/>
-              <w:right w:type="dxa" w:w="200"/>
-            </w:tcMar>
-          </w:tcPr>
-          <w:p>
-            <w:pPr>
-              <w:jc w:val="center"/>
-            </w:pPr>
-            <w:r>
-              <w:rPr>
-                <w:b/>
-                <w:bCs/>
-                <w:color w:val="8A6100"/>
-              </w:rPr>
-              <w:t xml:space="preserve">EVIDENCIA PENDIENTE: Monitor serie: cabecera de configuración y pulsaciones</w:t>
-            </w:r>
-          </w:p>
-          <w:p>
-            <w:pPr>
-              <w:jc w:val="center"/>
-            </w:pPr>
-            <w:r>
-              <w:rPr>
-                <w:color w:val="8A6100"/>
-                <w:sz w:val="17"/>
-                <w:szCs w:val="17"/>
-              </w:rPr>
-              <w:t xml:space="preserve">docs/evidencias/captura_monitor_serie.png</w:t>
-            </w:r>
-          </w:p>
-        </w:tc>
-      </w:tr>
-    </w:tbl>
     <w:p>
       <w:pPr>
-        <w:spacing w:after="180"/>
-      </w:pPr>
+        <w:spacing w:after="220"/>
+        <w:jc w:val="center"/>
+      </w:pPr>
+      <w:r>
+        <w:rPr>
+          <w:i/>
+          <w:iCs/>
+          <w:color w:val="52514E"/>
+          <w:sz w:val="17"/>
+          <w:szCs w:val="17"/>
+        </w:rPr>
+        <w:t xml:space="preserve">Prueba P3, pulsador suelto: LED apagado</w:t>
+      </w:r>
+    </w:p>
+    <w:p>
+      <w:pPr>
+        <w:spacing w:after="60" w:before="160"/>
+        <w:jc w:val="center"/>
+      </w:pPr>
+      <w:r>
+        <w:drawing>
+          <wp:inline distT="0" distB="0" distL="0" distR="0">
+            <wp:extent cx="3000375" cy="4000500"/>
+            <wp:effectExtent t="0" r="0" b="0" l="0"/>
+            <wp:docPr id="1" name="" descr="" title=""/>
+            <wp:cNvGraphicFramePr>
+              <a:graphicFrameLocks xmlns:a="http://schemas.openxmlformats.org/drawingml/2006/main" noChangeAspect="1"/>
+            </wp:cNvGraphicFramePr>
+            <a:graphic xmlns:a="http://schemas.openxmlformats.org/drawingml/2006/main">
+              <a:graphicData uri="http://schemas.openxmlformats.org/drawingml/2006/picture">
+                <pic:pic xmlns:pic="http://schemas.openxmlformats.org/drawingml/2006/picture">
+                  <pic:nvPicPr>
+                    <pic:cNvPr id="0" name="" descr=""/>
+                    <pic:cNvPicPr>
+                      <a:picLocks noChangeAspect="1" noChangeArrowheads="1"/>
+                    </pic:cNvPicPr>
+                  </pic:nvPicPr>
+                  <pic:blipFill>
+                    <a:blip r:embed="rId13" cstate="none"/>
+                    <a:srcRect/>
+                    <a:stretch>
+                      <a:fillRect/>
+                    </a:stretch>
+                  </pic:blipFill>
+                  <pic:spPr bwMode="auto">
+                    <a:xfrm>
+                      <a:off x="0" y="0"/>
+                      <a:ext cx="3000375" cy="4000500"/>
+                    </a:xfrm>
+                    <a:prstGeom prst="rect">
+                      <a:avLst/>
+                    </a:prstGeom>
+                  </pic:spPr>
+                </pic:pic>
+              </a:graphicData>
+            </a:graphic>
+          </wp:inline>
+        </w:drawing>
+      </w:r>
+    </w:p>
+    <w:p>
+      <w:pPr>
+        <w:spacing w:after="220"/>
+        <w:jc w:val="center"/>
+      </w:pPr>
+      <w:r>
+        <w:rPr>
+          <w:i/>
+          <w:iCs/>
+          <w:color w:val="52514E"/>
+          <w:sz w:val="17"/>
+          <w:szCs w:val="17"/>
+        </w:rPr>
+        <w:t xml:space="preserve">Prueba P4, pulsador presionado: LED encendido en verde</w:t>
+      </w:r>
+    </w:p>
+    <w:p>
+      <w:pPr>
+        <w:spacing w:after="60" w:before="160"/>
+        <w:jc w:val="center"/>
+      </w:pPr>
+      <w:r>
+        <w:drawing>
+          <wp:inline distT="0" distB="0" distL="0" distR="0">
+            <wp:extent cx="4171950" cy="4000500"/>
+            <wp:effectExtent t="0" r="0" b="0" l="0"/>
+            <wp:docPr id="1" name="" descr="" title=""/>
+            <wp:cNvGraphicFramePr>
+              <a:graphicFrameLocks xmlns:a="http://schemas.openxmlformats.org/drawingml/2006/main" noChangeAspect="1"/>
+            </wp:cNvGraphicFramePr>
+            <a:graphic xmlns:a="http://schemas.openxmlformats.org/drawingml/2006/main">
+              <a:graphicData uri="http://schemas.openxmlformats.org/drawingml/2006/picture">
+                <pic:pic xmlns:pic="http://schemas.openxmlformats.org/drawingml/2006/picture">
+                  <pic:nvPicPr>
+                    <pic:cNvPr id="0" name="" descr=""/>
+                    <pic:cNvPicPr>
+                      <a:picLocks noChangeAspect="1" noChangeArrowheads="1"/>
+                    </pic:cNvPicPr>
+                  </pic:nvPicPr>
+                  <pic:blipFill>
+                    <a:blip r:embed="rId14" cstate="none"/>
+                    <a:srcRect/>
+                    <a:stretch>
+                      <a:fillRect/>
+                    </a:stretch>
+                  </pic:blipFill>
+                  <pic:spPr bwMode="auto">
+                    <a:xfrm>
+                      <a:off x="0" y="0"/>
+                      <a:ext cx="4171950" cy="4000500"/>
+                    </a:xfrm>
+                    <a:prstGeom prst="rect">
+                      <a:avLst/>
+                    </a:prstGeom>
+                  </pic:spPr>
+                </pic:pic>
+              </a:graphicData>
+            </a:graphic>
+          </wp:inline>
+        </w:drawing>
+      </w:r>
+    </w:p>
+    <w:p>
+      <w:pPr>
+        <w:spacing w:after="220"/>
+        <w:jc w:val="center"/>
+      </w:pPr>
+      <w:r>
+        <w:rPr>
+          <w:i/>
+          <w:iCs/>
+          <w:color w:val="52514E"/>
+          <w:sz w:val="17"/>
+          <w:szCs w:val="17"/>
+        </w:rPr>
+        <w:t xml:space="preserve">Monitor serie de la placa: cabecera de configuración y pulsaciones (texto literal de los registros, extracto)</w:t>
+      </w:r>
     </w:p>
     <w:tbl>
       <w:tblPr>
@@ -7955,7 +8723,47 @@
         <w:rPr>
           <w:color w:val="1A1A1A"/>
         </w:rPr>
-        <w:t xml:space="preserve"> del pin: conecta una resistencia de ~45 kΩ que ya estaba dentro del chip. El firmware lee ese registro al arrancar para confirmar que el cambio se ha aplicado.</w:t>
+        <w:t xml:space="preserve"> del pin: conecta una resistencia de ~45 kΩ que ya estaba dentro del chip. El firmware lee ese registro al arrancar, y en la placa respondió </w:t>
+      </w:r>
+      <w:r>
+        <w:rPr>
+          <w:rFonts w:ascii="Consolas" w:cs="Consolas" w:eastAsia="Consolas" w:hAnsi="Consolas"/>
+          <w:color w:val="9A3412"/>
+          <w:sz w:val="19"/>
+          <w:szCs w:val="19"/>
+          <w:shd w:fill="F2F2EF" w:val="clear"/>
+        </w:rPr>
+        <w:t xml:space="preserve">pull-down: ACTIVADO</w:t>
+      </w:r>
+      <w:r>
+        <w:rPr>
+          <w:color w:val="1A1A1A"/>
+        </w:rPr>
+        <w:t xml:space="preserve">.</w:t>
+      </w:r>
+    </w:p>
+    <w:p>
+      <w:pPr>
+        <w:pStyle w:val="ListParagraph"/>
+        <w:numPr>
+          <w:ilvl w:val="0"/>
+          <w:numId w:val="2"/>
+        </w:numPr>
+        <w:spacing w:after="90"/>
+      </w:pPr>
+      <w:r>
+        <w:rPr>
+          <w:b/>
+          <w:bCs/>
+          <w:color w:val="1A1A1A"/>
+        </w:rPr>
+        <w:t xml:space="preserve">En la placa, la entrada fue estable y fiable.</w:t>
+      </w:r>
+      <w:r>
+        <w:rPr>
+          <w:color w:val="1A1A1A"/>
+        </w:rPr>
+        <w:t xml:space="preserve"> Se registraron 37 pulsaciones, una por cada pulsación real, sin ningún evento espurio en los tramos de reposo (el más largo, de 16 s) y sin ningún rebote detectado en las 74 transiciones.</w:t>
       </w:r>
     </w:p>
     <w:p>
@@ -8247,6 +9055,20 @@
                 <w:szCs w:val="17"/>
               </w:rPr>
               <w:t xml:space="preserve">python scripts/generar_figuras.py</w:t>
+            </w:r>
+          </w:p>
+          <w:p>
+            <w:pPr>
+              <w:spacing w:after="0" w:line="250"/>
+            </w:pPr>
+            <w:r>
+              <w:rPr>
+                <w:rFonts w:ascii="Consolas" w:cs="Consolas" w:eastAsia="Consolas" w:hAnsi="Consolas"/>
+                <w:color w:val="24292F"/>
+                <w:sz w:val="17"/>
+                <w:szCs w:val="17"/>
+              </w:rPr>
+              <w:t xml:space="preserve">python scripts/captura_monitor.py   # imagen del monitor serie, desde los registros de la placa</w:t>
             </w:r>
           </w:p>
           <w:p>

</xml_diff>